<commit_message>
add new CV page + trading updates
</commit_message>
<xml_diff>
--- a/TRADING/Manuale_influenceri/Gabi_Balu/Convingeri_prospere.docx
+++ b/TRADING/Manuale_influenceri/Gabi_Balu/Convingeri_prospere.docx
@@ -3304,8 +3304,517 @@
       <w:pPr>
         <w:spacing w:after="0" w:line="240" w:lineRule="auto"/>
       </w:pPr>
+      <w:proofErr w:type="spellStart"/>
+      <w:r>
+        <w:t>Convingerea</w:t>
+      </w:r>
+      <w:proofErr w:type="spellEnd"/>
+      <w:r>
+        <w:t xml:space="preserve"> </w:t>
+      </w:r>
+      <w:proofErr w:type="spellStart"/>
+      <w:r>
+        <w:t>pozitivă</w:t>
+      </w:r>
+      <w:proofErr w:type="spellEnd"/>
+      <w:r>
+        <w:t xml:space="preserve"> nr. 12:</w:t>
+      </w:r>
+      <w:r>
+        <w:t xml:space="preserve"> </w:t>
+      </w:r>
+      <w:r>
+        <w:t xml:space="preserve">"Merit </w:t>
+      </w:r>
+      <w:proofErr w:type="spellStart"/>
+      <w:r>
+        <w:t>să</w:t>
+      </w:r>
+      <w:proofErr w:type="spellEnd"/>
+      <w:r>
+        <w:t xml:space="preserve"> </w:t>
+      </w:r>
+      <w:proofErr w:type="spellStart"/>
+      <w:r>
+        <w:t>fiu</w:t>
+      </w:r>
+      <w:proofErr w:type="spellEnd"/>
+      <w:r>
+        <w:t xml:space="preserve"> </w:t>
+      </w:r>
+      <w:proofErr w:type="spellStart"/>
+      <w:r>
+        <w:t>bogat</w:t>
+      </w:r>
+      <w:proofErr w:type="spellEnd"/>
+      <w:r>
+        <w:t xml:space="preserve"> </w:t>
+      </w:r>
+      <w:proofErr w:type="spellStart"/>
+      <w:r>
+        <w:t>pentru</w:t>
+      </w:r>
+      <w:proofErr w:type="spellEnd"/>
+      <w:r>
+        <w:t xml:space="preserve"> </w:t>
+      </w:r>
+      <w:proofErr w:type="spellStart"/>
+      <w:r>
+        <w:t>că</w:t>
+      </w:r>
+      <w:proofErr w:type="spellEnd"/>
+      <w:r>
+        <w:t xml:space="preserve"> </w:t>
+      </w:r>
+      <w:proofErr w:type="spellStart"/>
+      <w:r>
+        <w:t>ofer</w:t>
+      </w:r>
+      <w:proofErr w:type="spellEnd"/>
+      <w:r>
+        <w:t xml:space="preserve"> </w:t>
+      </w:r>
+      <w:proofErr w:type="spellStart"/>
+      <w:r>
+        <w:t>foarte</w:t>
+      </w:r>
+      <w:proofErr w:type="spellEnd"/>
+      <w:r>
+        <w:t xml:space="preserve"> </w:t>
+      </w:r>
+      <w:proofErr w:type="spellStart"/>
+      <w:r>
+        <w:t>multă</w:t>
+      </w:r>
+      <w:proofErr w:type="spellEnd"/>
+      <w:r>
+        <w:t xml:space="preserve"> </w:t>
+      </w:r>
+      <w:proofErr w:type="spellStart"/>
+      <w:r>
+        <w:t>valoare</w:t>
+      </w:r>
+      <w:proofErr w:type="spellEnd"/>
+      <w:r>
+        <w:t xml:space="preserve"> </w:t>
+      </w:r>
+      <w:proofErr w:type="spellStart"/>
+      <w:r>
+        <w:t>adăugată</w:t>
+      </w:r>
+      <w:proofErr w:type="spellEnd"/>
+      <w:r>
+        <w:t xml:space="preserve"> </w:t>
+      </w:r>
+      <w:proofErr w:type="spellStart"/>
+      <w:r>
+        <w:t>oamenilor</w:t>
+      </w:r>
+      <w:proofErr w:type="spellEnd"/>
+      <w:r>
+        <w:t>!"</w:t>
+      </w:r>
+    </w:p>
+    <w:p>
+      <w:proofErr w:type="spellStart"/>
+      <w:r>
+        <w:t>Convingerea</w:t>
+      </w:r>
+      <w:proofErr w:type="spellEnd"/>
+      <w:r>
+        <w:t xml:space="preserve"> </w:t>
+      </w:r>
+      <w:proofErr w:type="spellStart"/>
+      <w:r>
+        <w:t>prosperă</w:t>
+      </w:r>
+      <w:proofErr w:type="spellEnd"/>
+      <w:r>
+        <w:t xml:space="preserve"> nr. 13:</w:t>
+      </w:r>
+      <w:r>
+        <w:t xml:space="preserve"> </w:t>
+      </w:r>
+      <w:r>
+        <w:t xml:space="preserve">"Sunt </w:t>
+      </w:r>
+      <w:proofErr w:type="spellStart"/>
+      <w:r>
+        <w:t>generos</w:t>
+      </w:r>
+      <w:proofErr w:type="spellEnd"/>
+      <w:r>
+        <w:t xml:space="preserve"> cu </w:t>
+      </w:r>
+      <w:proofErr w:type="spellStart"/>
+      <w:r>
+        <w:t>cei</w:t>
+      </w:r>
+      <w:proofErr w:type="spellEnd"/>
+      <w:r>
+        <w:t xml:space="preserve"> care au </w:t>
+      </w:r>
+      <w:proofErr w:type="spellStart"/>
+      <w:r>
+        <w:t>nevoie</w:t>
+      </w:r>
+      <w:proofErr w:type="spellEnd"/>
+      <w:r>
+        <w:t xml:space="preserve"> </w:t>
+      </w:r>
+      <w:proofErr w:type="spellStart"/>
+      <w:r>
+        <w:t>și</w:t>
+      </w:r>
+      <w:proofErr w:type="spellEnd"/>
+      <w:r>
+        <w:t xml:space="preserve"> </w:t>
+      </w:r>
+      <w:proofErr w:type="spellStart"/>
+      <w:r>
+        <w:t>primesc</w:t>
+      </w:r>
+      <w:proofErr w:type="spellEnd"/>
+      <w:r>
+        <w:t xml:space="preserve"> cu </w:t>
+      </w:r>
+      <w:proofErr w:type="spellStart"/>
+      <w:r>
+        <w:t>inima</w:t>
+      </w:r>
+      <w:proofErr w:type="spellEnd"/>
+      <w:r>
+        <w:t xml:space="preserve"> </w:t>
+      </w:r>
+      <w:proofErr w:type="spellStart"/>
+      <w:r>
+        <w:t>deschisă</w:t>
+      </w:r>
+      <w:proofErr w:type="spellEnd"/>
+      <w:r>
+        <w:t xml:space="preserve"> tot </w:t>
+      </w:r>
+      <w:proofErr w:type="spellStart"/>
+      <w:r>
+        <w:t>ce</w:t>
+      </w:r>
+      <w:proofErr w:type="spellEnd"/>
+      <w:r>
+        <w:t xml:space="preserve"> mi se </w:t>
+      </w:r>
+      <w:proofErr w:type="spellStart"/>
+      <w:r>
+        <w:t>oferă</w:t>
+      </w:r>
+      <w:proofErr w:type="spellEnd"/>
+      <w:r>
+        <w:t>!"</w:t>
+      </w:r>
     </w:p>
     <w:p/>
+    <w:p>
+      <w:pPr>
+        <w:spacing w:after="0" w:line="240" w:lineRule="auto"/>
+      </w:pPr>
+      <w:proofErr w:type="spellStart"/>
+      <w:r>
+        <w:t>Dacă</w:t>
+      </w:r>
+      <w:proofErr w:type="spellEnd"/>
+      <w:r>
+        <w:t xml:space="preserve"> </w:t>
+      </w:r>
+      <w:proofErr w:type="spellStart"/>
+      <w:r>
+        <w:t>ești</w:t>
+      </w:r>
+      <w:proofErr w:type="spellEnd"/>
+      <w:r>
+        <w:t xml:space="preserve"> o </w:t>
+      </w:r>
+      <w:proofErr w:type="spellStart"/>
+      <w:r>
+        <w:t>floare</w:t>
+      </w:r>
+      <w:proofErr w:type="spellEnd"/>
+      <w:r>
+        <w:t xml:space="preserve"> </w:t>
+      </w:r>
+      <w:proofErr w:type="spellStart"/>
+      <w:r>
+        <w:t>între</w:t>
+      </w:r>
+      <w:proofErr w:type="spellEnd"/>
+      <w:r>
+        <w:t xml:space="preserve"> </w:t>
+      </w:r>
+      <w:proofErr w:type="spellStart"/>
+      <w:r>
+        <w:t>buruieni</w:t>
+      </w:r>
+      <w:proofErr w:type="spellEnd"/>
+      <w:r>
+        <w:t xml:space="preserve"> </w:t>
+      </w:r>
+      <w:proofErr w:type="spellStart"/>
+      <w:r>
+        <w:t>și</w:t>
+      </w:r>
+      <w:proofErr w:type="spellEnd"/>
+      <w:r>
+        <w:t xml:space="preserve"> </w:t>
+      </w:r>
+      <w:proofErr w:type="spellStart"/>
+      <w:r>
+        <w:t>nimeni</w:t>
+      </w:r>
+      <w:proofErr w:type="spellEnd"/>
+      <w:r>
+        <w:t xml:space="preserve"> nu </w:t>
+      </w:r>
+      <w:proofErr w:type="spellStart"/>
+      <w:r>
+        <w:t>te</w:t>
+      </w:r>
+      <w:proofErr w:type="spellEnd"/>
+      <w:r>
+        <w:t xml:space="preserve"> </w:t>
+      </w:r>
+      <w:proofErr w:type="spellStart"/>
+      <w:r>
+        <w:t>îngrijește</w:t>
+      </w:r>
+      <w:proofErr w:type="spellEnd"/>
+      <w:r>
+        <w:t xml:space="preserve">, e </w:t>
+      </w:r>
+      <w:proofErr w:type="spellStart"/>
+      <w:r>
+        <w:t>foarte</w:t>
+      </w:r>
+      <w:proofErr w:type="spellEnd"/>
+      <w:r>
+        <w:t xml:space="preserve"> </w:t>
+      </w:r>
+      <w:proofErr w:type="spellStart"/>
+      <w:r>
+        <w:t>greu</w:t>
+      </w:r>
+      <w:proofErr w:type="spellEnd"/>
+      <w:r>
+        <w:t xml:space="preserve"> </w:t>
+      </w:r>
+      <w:proofErr w:type="spellStart"/>
+      <w:r>
+        <w:t>să</w:t>
+      </w:r>
+      <w:proofErr w:type="spellEnd"/>
+      <w:r>
+        <w:t xml:space="preserve"> </w:t>
+      </w:r>
+      <w:proofErr w:type="spellStart"/>
+      <w:r>
+        <w:t>crești</w:t>
+      </w:r>
+      <w:proofErr w:type="spellEnd"/>
+      <w:r>
+        <w:t xml:space="preserve">. </w:t>
+      </w:r>
+    </w:p>
+    <w:p>
+      <w:pPr>
+        <w:spacing w:after="0" w:line="240" w:lineRule="auto"/>
+      </w:pPr>
+      <w:proofErr w:type="spellStart"/>
+      <w:r>
+        <w:t>Dacă</w:t>
+      </w:r>
+      <w:proofErr w:type="spellEnd"/>
+      <w:r>
+        <w:t xml:space="preserve"> </w:t>
+      </w:r>
+      <w:proofErr w:type="spellStart"/>
+      <w:r>
+        <w:t>ești</w:t>
+      </w:r>
+      <w:proofErr w:type="spellEnd"/>
+      <w:r>
+        <w:t xml:space="preserve"> o </w:t>
+      </w:r>
+      <w:proofErr w:type="spellStart"/>
+      <w:r>
+        <w:t>floare</w:t>
+      </w:r>
+      <w:proofErr w:type="spellEnd"/>
+      <w:r>
+        <w:t xml:space="preserve"> </w:t>
+      </w:r>
+      <w:proofErr w:type="spellStart"/>
+      <w:r>
+        <w:t>singură</w:t>
+      </w:r>
+      <w:proofErr w:type="spellEnd"/>
+      <w:r>
+        <w:t xml:space="preserve"> pe un sol </w:t>
+      </w:r>
+      <w:proofErr w:type="spellStart"/>
+      <w:r>
+        <w:t>infertil</w:t>
+      </w:r>
+      <w:proofErr w:type="spellEnd"/>
+      <w:r>
+        <w:t xml:space="preserve">, e </w:t>
+      </w:r>
+      <w:proofErr w:type="spellStart"/>
+      <w:r>
+        <w:t>foarte</w:t>
+      </w:r>
+      <w:proofErr w:type="spellEnd"/>
+      <w:r>
+        <w:t xml:space="preserve"> </w:t>
+      </w:r>
+      <w:proofErr w:type="spellStart"/>
+      <w:r>
+        <w:t>greu</w:t>
+      </w:r>
+      <w:proofErr w:type="spellEnd"/>
+      <w:r>
+        <w:t xml:space="preserve"> </w:t>
+      </w:r>
+      <w:proofErr w:type="spellStart"/>
+      <w:r>
+        <w:t>să</w:t>
+      </w:r>
+      <w:proofErr w:type="spellEnd"/>
+      <w:r>
+        <w:t xml:space="preserve"> </w:t>
+      </w:r>
+      <w:proofErr w:type="spellStart"/>
+      <w:r>
+        <w:t>crești</w:t>
+      </w:r>
+      <w:proofErr w:type="spellEnd"/>
+      <w:r>
+        <w:t>.</w:t>
+      </w:r>
+    </w:p>
+    <w:p>
+      <w:pPr>
+        <w:spacing w:after="0" w:line="240" w:lineRule="auto"/>
+      </w:pPr>
+      <w:proofErr w:type="spellStart"/>
+      <w:r>
+        <w:t>Dacă</w:t>
+      </w:r>
+      <w:proofErr w:type="spellEnd"/>
+      <w:r>
+        <w:t xml:space="preserve"> </w:t>
+      </w:r>
+      <w:proofErr w:type="spellStart"/>
+      <w:r>
+        <w:t>ești</w:t>
+      </w:r>
+      <w:proofErr w:type="spellEnd"/>
+      <w:r>
+        <w:t xml:space="preserve"> o </w:t>
+      </w:r>
+      <w:proofErr w:type="spellStart"/>
+      <w:r>
+        <w:t>floare</w:t>
+      </w:r>
+      <w:proofErr w:type="spellEnd"/>
+      <w:r>
+        <w:t xml:space="preserve"> </w:t>
+      </w:r>
+      <w:proofErr w:type="spellStart"/>
+      <w:r>
+        <w:t>între</w:t>
+      </w:r>
+      <w:proofErr w:type="spellEnd"/>
+      <w:r>
+        <w:t xml:space="preserve"> </w:t>
+      </w:r>
+      <w:proofErr w:type="spellStart"/>
+      <w:r>
+        <w:t>flori</w:t>
+      </w:r>
+      <w:proofErr w:type="spellEnd"/>
+      <w:r>
+        <w:t xml:space="preserve"> </w:t>
+      </w:r>
+      <w:proofErr w:type="spellStart"/>
+      <w:r>
+        <w:t>într</w:t>
+      </w:r>
+      <w:proofErr w:type="spellEnd"/>
+      <w:r>
+        <w:t xml:space="preserve">-un sol </w:t>
+      </w:r>
+      <w:proofErr w:type="spellStart"/>
+      <w:r>
+        <w:t>fertil</w:t>
+      </w:r>
+      <w:proofErr w:type="spellEnd"/>
+      <w:r>
+        <w:t xml:space="preserve"> </w:t>
+      </w:r>
+      <w:proofErr w:type="spellStart"/>
+      <w:r>
+        <w:t>și</w:t>
+      </w:r>
+      <w:proofErr w:type="spellEnd"/>
+      <w:r>
+        <w:t xml:space="preserve"> ai </w:t>
+      </w:r>
+      <w:proofErr w:type="spellStart"/>
+      <w:r>
+        <w:t>parte</w:t>
+      </w:r>
+      <w:proofErr w:type="spellEnd"/>
+      <w:r>
+        <w:t xml:space="preserve"> de </w:t>
+      </w:r>
+      <w:proofErr w:type="spellStart"/>
+      <w:r>
+        <w:t>îngrijire</w:t>
+      </w:r>
+      <w:proofErr w:type="spellEnd"/>
+      <w:r>
+        <w:t xml:space="preserve"> </w:t>
+      </w:r>
+      <w:proofErr w:type="spellStart"/>
+      <w:r>
+        <w:t>constantă</w:t>
+      </w:r>
+      <w:proofErr w:type="spellEnd"/>
+      <w:r>
+        <w:t xml:space="preserve">, </w:t>
+      </w:r>
+      <w:proofErr w:type="spellStart"/>
+      <w:r>
+        <w:t>vei</w:t>
+      </w:r>
+      <w:proofErr w:type="spellEnd"/>
+      <w:r>
+        <w:t xml:space="preserve"> </w:t>
+      </w:r>
+      <w:proofErr w:type="spellStart"/>
+      <w:r>
+        <w:t>crește</w:t>
+      </w:r>
+      <w:proofErr w:type="spellEnd"/>
+      <w:r>
+        <w:t xml:space="preserve"> </w:t>
+      </w:r>
+      <w:proofErr w:type="spellStart"/>
+      <w:r>
+        <w:t>frumos</w:t>
+      </w:r>
+      <w:proofErr w:type="spellEnd"/>
+      <w:r>
+        <w:t>.</w:t>
+      </w:r>
+    </w:p>
     <w:p/>
     <w:sectPr>
       <w:pgSz w:w="12240" w:h="15840"/>
@@ -3920,6 +4429,7 @@
   <w:style w:type="character" w:default="1" w:styleId="Fontdeparagrafimplicit">
     <w:name w:val="Default Paragraph Font"/>
     <w:uiPriority w:val="1"/>
+    <w:semiHidden/>
     <w:unhideWhenUsed/>
   </w:style>
   <w:style w:type="table" w:default="1" w:styleId="TabelNormal">

</xml_diff>

<commit_message>
Initial commit — news dashboard
</commit_message>
<xml_diff>
--- a/TRADING/Manuale_influenceri/Gabi_Balu/Convingeri_prospere.docx
+++ b/TRADING/Manuale_influenceri/Gabi_Balu/Convingeri_prospere.docx
@@ -221,35 +221,37 @@
         <w:spacing w:after="0" w:line="240" w:lineRule="auto"/>
       </w:pPr>
       <w:r>
-        <w:t>Convingerea pozitivă nr. 22:</w:t>
+        <w:t xml:space="preserve">Convingerea pozitivă nr. 22: "Banii îmi permit să </w:t>
+      </w:r>
+      <w:proofErr w:type="spellStart"/>
+      <w:r>
+        <w:t>impactez</w:t>
+      </w:r>
+      <w:proofErr w:type="spellEnd"/>
+      <w:r>
+        <w:t xml:space="preserve"> în bine viețile oamenilor!"</w:t>
+      </w:r>
+    </w:p>
+    <w:p>
+      <w:pPr>
+        <w:spacing w:after="0" w:line="240" w:lineRule="auto"/>
+      </w:pPr>
+      <w:r>
+        <w:t>Convingerea prosperă nr. 23: "Învăț să gestionez ce am pentru a putea primi mai mult!"</w:t>
+      </w:r>
+    </w:p>
+    <w:p>
+      <w:pPr>
+        <w:spacing w:after="0" w:line="240" w:lineRule="auto"/>
+      </w:pPr>
+      <w:r>
+        <w:t>Convingerea prosperă nr. 24:</w:t>
       </w:r>
       <w:r>
         <w:t xml:space="preserve"> </w:t>
       </w:r>
       <w:r>
-        <w:t xml:space="preserve">"Banii îmi permit să </w:t>
-      </w:r>
-      <w:proofErr w:type="spellStart"/>
-      <w:r>
-        <w:t>impactez</w:t>
-      </w:r>
-      <w:proofErr w:type="spellEnd"/>
-      <w:r>
-        <w:t xml:space="preserve"> în bine viețile oamenilor!"</w:t>
-      </w:r>
-    </w:p>
-    <w:p>
-      <w:pPr>
-        <w:spacing w:after="0" w:line="240" w:lineRule="auto"/>
-      </w:pPr>
-      <w:r>
-        <w:t>Convingerea prosperă nr. 23:</w:t>
-      </w:r>
-      <w:r>
-        <w:t xml:space="preserve"> </w:t>
-      </w:r>
-      <w:r>
-        <w:t>"Învăț să gestionez ce am pentru a putea primi mai mult!"</w:t>
+        <w:t>Atât sărăcia cât și bogăția sunt niște alegeri. Iar eu aleg să fiu bogat.</w:t>
       </w:r>
     </w:p>
     <w:p>

</xml_diff>

<commit_message>
trading update + ai
</commit_message>
<xml_diff>
--- a/TRADING/Manuale_influenceri/Gabi_Balu/Convingeri_prospere.docx
+++ b/TRADING/Manuale_influenceri/Gabi_Balu/Convingeri_prospere.docx
@@ -285,65 +285,80 @@
         <w:spacing w:after="0" w:line="240" w:lineRule="auto"/>
       </w:pPr>
       <w:r>
-        <w:t>Convingerea prosperă nr. 29:</w:t>
+        <w:t>Convingerea prosperă nr. 29: „Lumea interioară îmi creează lumea exterioară!”</w:t>
+      </w:r>
+    </w:p>
+    <w:p>
+      <w:pPr>
+        <w:spacing w:after="0" w:line="240" w:lineRule="auto"/>
+      </w:pPr>
+      <w:r>
+        <w:t>Convingerea prosperă nr. 30: „Investesc lunar conform planului meu pentru a crea bogăție pe termen lung!”</w:t>
+      </w:r>
+    </w:p>
+    <w:p>
+      <w:pPr>
+        <w:spacing w:after="0" w:line="240" w:lineRule="auto"/>
+      </w:pPr>
+      <w:r>
+        <w:t>Convingerea prosperă nr. 31:</w:t>
       </w:r>
       <w:r>
         <w:t xml:space="preserve"> </w:t>
       </w:r>
       <w:r>
-        <w:t>„Lumea interioară îmi creează lumea exterioară!”</w:t>
-      </w:r>
-    </w:p>
-    <w:p>
-      <w:pPr>
-        <w:spacing w:after="0" w:line="240" w:lineRule="auto"/>
-      </w:pPr>
-      <w:r>
-        <w:t>Convingerea prosperă nr. 30:</w:t>
+        <w:t>„Banii creează liniște și calm! Aleg să am bani, aleg să am liniște și calm!”</w:t>
+      </w:r>
+    </w:p>
+    <w:p>
+      <w:pPr>
+        <w:spacing w:after="0" w:line="240" w:lineRule="auto"/>
+      </w:pPr>
+      <w:r>
+        <w:t>Convingerea prosperă nr. 32:</w:t>
       </w:r>
       <w:r>
         <w:t xml:space="preserve"> </w:t>
       </w:r>
       <w:r>
-        <w:t>„Investesc lunar conform planului meu pentru a crea bogăție pe termen lung!”</w:t>
-      </w:r>
-    </w:p>
-    <w:p>
-      <w:pPr>
-        <w:spacing w:after="0" w:line="240" w:lineRule="auto"/>
-      </w:pPr>
-    </w:p>
-    <w:p>
-      <w:pPr>
-        <w:spacing w:after="0" w:line="240" w:lineRule="auto"/>
-      </w:pPr>
-    </w:p>
-    <w:p>
-      <w:pPr>
-        <w:spacing w:after="0" w:line="240" w:lineRule="auto"/>
-      </w:pPr>
-    </w:p>
-    <w:p>
-      <w:pPr>
-        <w:spacing w:after="0" w:line="240" w:lineRule="auto"/>
-      </w:pPr>
-    </w:p>
-    <w:p>
-      <w:pPr>
-        <w:spacing w:after="0" w:line="240" w:lineRule="auto"/>
-      </w:pPr>
-    </w:p>
-    <w:p>
-      <w:pPr>
-        <w:spacing w:after="0" w:line="240" w:lineRule="auto"/>
-      </w:pPr>
-    </w:p>
-    <w:p>
-      <w:pPr>
-        <w:spacing w:after="0" w:line="240" w:lineRule="auto"/>
-      </w:pPr>
-      <w:r>
-        <w:lastRenderedPageBreak/>
+        <w:t>„Nu pot ajuta săracii dacă sunt unul dintre ei. ALEG să fiu bogat!”</w:t>
+      </w:r>
+    </w:p>
+    <w:p>
+      <w:pPr>
+        <w:spacing w:after="0" w:line="240" w:lineRule="auto"/>
+      </w:pPr>
+    </w:p>
+    <w:p>
+      <w:pPr>
+        <w:spacing w:after="0" w:line="240" w:lineRule="auto"/>
+      </w:pPr>
+    </w:p>
+    <w:p>
+      <w:pPr>
+        <w:spacing w:after="0" w:line="240" w:lineRule="auto"/>
+      </w:pPr>
+    </w:p>
+    <w:p>
+      <w:pPr>
+        <w:spacing w:after="0" w:line="240" w:lineRule="auto"/>
+      </w:pPr>
+    </w:p>
+    <w:p>
+      <w:pPr>
+        <w:spacing w:after="0" w:line="240" w:lineRule="auto"/>
+      </w:pPr>
+    </w:p>
+    <w:p>
+      <w:pPr>
+        <w:spacing w:after="0" w:line="240" w:lineRule="auto"/>
+      </w:pPr>
+    </w:p>
+    <w:p>
+      <w:pPr>
+        <w:spacing w:after="0" w:line="240" w:lineRule="auto"/>
+      </w:pPr>
+      <w:r>
         <w:t xml:space="preserve">Dacă ești o floare între buruieni și nimeni nu te îngrijește, e foarte greu să crești. </w:t>
       </w:r>
     </w:p>

</xml_diff>

<commit_message>
trading updates + ai accelerator
</commit_message>
<xml_diff>
--- a/TRADING/Manuale_influenceri/Gabi_Balu/Convingeri_prospere.docx
+++ b/TRADING/Manuale_influenceri/Gabi_Balu/Convingeri_prospere.docx
@@ -24,22 +24,86 @@
     </w:p>
     <w:p>
       <w:r>
-        <w:t xml:space="preserve">Capcana EBITDA și realitatea EBIT. După cheltuielile operaționale ajungem la EBITDA. Mulți investitori îl iubesc, dar unii, precum Charlie Munger, l-au considerat periculos. De ce? Pentru că ignoră deprecierea și amortizarea. Echipamentele se strică, fabricile se învechesc... De aceea, indicatorul EBIT (Profitul Operațional) este mult mai onest, deoarece scade și uzura activelor. </w:t>
-      </w:r>
-    </w:p>
-    <w:p>
-      <w:r>
-        <w:t>Profitul net. După plata dobânzilor și a taxelor, rămânem cu Profitul Net. Aici nu căutăm doar o cifră mare, ci relația ei cu veniturile. Dacă profitul net crește procentual mai repede decât cifra de afaceri, avem „efect de levier operațional”. Asta înseamnă că firma devine mai profitabilă pe măsură ce se scalează, transformând fiecare dolar încasat în tot mai mulți cenți de profit.</w:t>
-      </w:r>
-    </w:p>
-    <w:p>
-      <w:r>
-        <w:t>ROCE: Eficiența capitalului Return on Capital Employed ne arată cât profit generează firma raportat la capitalul investit. Revenind la exemplul Apple, ROCE a crescut de la 29% în 2020 la aproape 70% astăzi. Asta înseamnă că pentru fiecare dolar investit în active, business-ul generează aproape 70 de cenți profit. Această eficiență separă o companie care necesită investiții masive doar pentru a supraviețui, de o adevărată „compounding machine”.</w:t>
-      </w:r>
-    </w:p>
-    <w:p>
-      <w:r>
-        <w:t>În concluzie, data viitoare când analizați o companie, treceți-o prin acest filtru logic: cresc veniturile? Este marja brută stabilă sau în creștere? Este EBIT-ul solid după scăderea uzurii? Și, cel mai important, cât de eficient este folosit capitalul (ROCE)? Doar așa eliminați zgomotul și rămâneți cu investițiile de calitate.</w:t>
+        <w:t xml:space="preserve">Capcana EBITDA și realitatea EBIT. După cheltuielile operaționale ajungem la EBITDA. Mulți investitori îl iubesc, dar unii, precum Charlie </w:t>
+      </w:r>
+      <w:proofErr w:type="spellStart"/>
+      <w:r>
+        <w:t>Munger</w:t>
+      </w:r>
+      <w:proofErr w:type="spellEnd"/>
+      <w:r>
+        <w:t xml:space="preserve">, l-au considerat periculos. De ce? Pentru că ignoră deprecierea și amortizarea. Echipamentele se strică, fabricile se învechesc... De aceea, indicatorul EBIT (Profitul Operațional) este mult mai onest, deoarece scade și uzura activelor. </w:t>
+      </w:r>
+    </w:p>
+    <w:p>
+      <w:r>
+        <w:t xml:space="preserve">Profitul net. După plata dobânzilor și a taxelor, rămânem cu Profitul Net. Aici nu căutăm doar o cifră mare, ci relația ei cu veniturile. Dacă profitul net crește procentual mai repede decât cifra de afaceri, avem „efect de levier operațional”. Asta înseamnă că firma devine mai profitabilă pe măsură ce se </w:t>
+      </w:r>
+      <w:proofErr w:type="spellStart"/>
+      <w:r>
+        <w:t>scalează</w:t>
+      </w:r>
+      <w:proofErr w:type="spellEnd"/>
+      <w:r>
+        <w:t>, transformând fiecare dolar încasat în tot mai mulți cenți de profit.</w:t>
+      </w:r>
+    </w:p>
+    <w:p>
+      <w:r>
+        <w:t xml:space="preserve">ROCE: Eficiența capitalului </w:t>
+      </w:r>
+      <w:proofErr w:type="spellStart"/>
+      <w:r>
+        <w:t>Return</w:t>
+      </w:r>
+      <w:proofErr w:type="spellEnd"/>
+      <w:r>
+        <w:t xml:space="preserve"> on Capital </w:t>
+      </w:r>
+      <w:proofErr w:type="spellStart"/>
+      <w:r>
+        <w:t>Employed</w:t>
+      </w:r>
+      <w:proofErr w:type="spellEnd"/>
+      <w:r>
+        <w:t xml:space="preserve"> ne arată cât profit generează firma raportat la capitalul investit. Revenind la exemplul Apple, ROCE a crescut de la 29% în 2020 la aproape 70% astăzi. Asta înseamnă că pentru fiecare dolar investit în active, business-</w:t>
+      </w:r>
+      <w:proofErr w:type="spellStart"/>
+      <w:r>
+        <w:t>ul</w:t>
+      </w:r>
+      <w:proofErr w:type="spellEnd"/>
+      <w:r>
+        <w:t xml:space="preserve"> generează aproape 70 de cenți profit. Această eficiență separă o companie care necesită investiții masive doar pentru a supraviețui, de o adevărată „</w:t>
+      </w:r>
+      <w:proofErr w:type="spellStart"/>
+      <w:r>
+        <w:t>compounding</w:t>
+      </w:r>
+      <w:proofErr w:type="spellEnd"/>
+      <w:r>
+        <w:t xml:space="preserve"> </w:t>
+      </w:r>
+      <w:proofErr w:type="spellStart"/>
+      <w:r>
+        <w:t>machine</w:t>
+      </w:r>
+      <w:proofErr w:type="spellEnd"/>
+      <w:r>
+        <w:t>”.</w:t>
+      </w:r>
+    </w:p>
+    <w:p>
+      <w:r>
+        <w:t>În concluzie, data viitoare când analizați o companie, treceți-o prin acest filtru logic: cresc veniturile? Este marja brută stabilă sau în creștere? Este EBIT-</w:t>
+      </w:r>
+      <w:proofErr w:type="spellStart"/>
+      <w:r>
+        <w:t>ul</w:t>
+      </w:r>
+      <w:proofErr w:type="spellEnd"/>
+      <w:r>
+        <w:t xml:space="preserve"> solid după scăderea uzurii? Și, cel mai important, cât de eficient este folosit capitalul (ROCE)? Doar așa eliminați zgomotul și rămâneți cu investițiile de calitate.</w:t>
       </w:r>
     </w:p>
     <w:p>
@@ -181,7 +245,15 @@
         <w:spacing w:after="0" w:line="240" w:lineRule="auto"/>
       </w:pPr>
       <w:r>
-        <w:t>Convingerea pozitivă nr. 22: "Banii îmi permit să impactez în bine viețile oamenilor!"</w:t>
+        <w:t xml:space="preserve">Convingerea pozitivă nr. 22: "Banii îmi permit să </w:t>
+      </w:r>
+      <w:proofErr w:type="spellStart"/>
+      <w:r>
+        <w:t>impactez</w:t>
+      </w:r>
+      <w:proofErr w:type="spellEnd"/>
+      <w:r>
+        <w:t xml:space="preserve"> în bine viețile oamenilor!"</w:t>
       </w:r>
     </w:p>
     <w:p>
@@ -438,55 +510,242 @@
         <w:spacing w:after="0" w:line="240" w:lineRule="auto"/>
       </w:pPr>
       <w:r>
-        <w:t>Convingerea prosperă nr. 56:</w:t>
+        <w:t>Convingerea prosperă nr. 56: „A avea un singur flux de venit este foarte aproape de a avea 0 fluxuri de venit. Așa că eu îmi creez multiple surse de venit!"</w:t>
+      </w:r>
+    </w:p>
+    <w:p>
+      <w:pPr>
+        <w:spacing w:after="0" w:line="240" w:lineRule="auto"/>
+      </w:pPr>
+      <w:r>
+        <w:t>Convingerea prosperă nr. 57: „Banii vin către mine pentru că știu să primesc. Sunt deschis la a primi!"</w:t>
+      </w:r>
+    </w:p>
+    <w:p>
+      <w:pPr>
+        <w:spacing w:after="0" w:line="240" w:lineRule="auto"/>
+      </w:pPr>
+      <w:r>
+        <w:t>Convingerea prosperă nr. 58: „Când voi conștientiza că DOAR EU îmi limitez veniturile și potențialul, atunci nu mă va mai opri nimic din a-mi atinge țelurile!"</w:t>
+      </w:r>
+    </w:p>
+    <w:p>
+      <w:pPr>
+        <w:spacing w:after="0" w:line="240" w:lineRule="auto"/>
+      </w:pPr>
+      <w:r>
+        <w:t>Convingerea prosperă nr. 59: „Sunt gata să trăiesc în acord cu valorile și principiile mele, nu cu ce vrea societatea!"</w:t>
+      </w:r>
+    </w:p>
+    <w:p>
+      <w:pPr>
+        <w:spacing w:after="0" w:line="240" w:lineRule="auto"/>
+      </w:pPr>
+      <w:r>
+        <w:t>Convingerea prosperă nr. 60:</w:t>
       </w:r>
       <w:r>
         <w:t xml:space="preserve"> </w:t>
       </w:r>
       <w:r>
-        <w:t>„A avea un singur flux de venit este foarte aproape de a avea 0 fluxuri de venit. Așa că eu îmi creez multiple surse de venit!"</w:t>
-      </w:r>
-    </w:p>
-    <w:p>
-      <w:pPr>
-        <w:spacing w:after="0" w:line="240" w:lineRule="auto"/>
-      </w:pPr>
-      <w:r>
-        <w:t>Convingerea prosperă nr. 57:</w:t>
+        <w:t>„Astăzi este o zi minunată de a deveni o versiune și mai bună a mea decât am fost ieri!"</w:t>
+      </w:r>
+    </w:p>
+    <w:p>
+      <w:pPr>
+        <w:spacing w:after="0" w:line="240" w:lineRule="auto"/>
+      </w:pPr>
+      <w:r>
+        <w:t>Convingerea prosperă nr. 61:</w:t>
       </w:r>
       <w:r>
         <w:t xml:space="preserve"> </w:t>
       </w:r>
       <w:r>
-        <w:t>„Banii vin către mine pentru că știu să primesc. Sunt deschis la a primi!"</w:t>
-      </w:r>
-    </w:p>
-    <w:p>
-      <w:pPr>
-        <w:spacing w:after="0" w:line="240" w:lineRule="auto"/>
-      </w:pPr>
-      <w:r>
-        <w:t>Convingerea prosperă nr. 58:</w:t>
+        <w:t>NU voi mai lăsa frica să-mi fure oportunitățile de a crea BOGĂȚIE!</w:t>
+      </w:r>
+    </w:p>
+    <w:p>
+      <w:pPr>
+        <w:spacing w:after="0" w:line="240" w:lineRule="auto"/>
+      </w:pPr>
+      <w:r>
+        <w:t>Convingerea prosperă nr. 62:</w:t>
       </w:r>
       <w:r>
         <w:t xml:space="preserve"> </w:t>
       </w:r>
       <w:r>
-        <w:t>„Când voi conștientiza că DOAR EU îmi limitez veniturile și potențialul, atunci nu mă va mai opri nimic din a-mi atinge țelurile!"</w:t>
-      </w:r>
-    </w:p>
-    <w:p>
-      <w:pPr>
-        <w:spacing w:after="0" w:line="240" w:lineRule="auto"/>
-      </w:pPr>
-      <w:r>
-        <w:t>Convingerea prosperă nr. 59:</w:t>
+        <w:t>Sunt un investitor hotărât să strângă AVERE pe termen lung pentru mine și familia mea!</w:t>
+      </w:r>
+    </w:p>
+    <w:p>
+      <w:pPr>
+        <w:spacing w:after="0" w:line="240" w:lineRule="auto"/>
+      </w:pPr>
+      <w:r>
+        <w:t>Convingerea prosperă nr. 63:</w:t>
       </w:r>
       <w:r>
         <w:t xml:space="preserve"> </w:t>
       </w:r>
       <w:r>
-        <w:t>„Sunt gata să trăiesc în acord cu valorile și principiile mele, nu cu ce vrea societatea!"</w:t>
+        <w:t>Iau decizii înțelepte în prezent pentru că ele îmi modelează viitorul!</w:t>
+      </w:r>
+    </w:p>
+    <w:p>
+      <w:pPr>
+        <w:spacing w:after="0" w:line="240" w:lineRule="auto"/>
+      </w:pPr>
+      <w:r>
+        <w:lastRenderedPageBreak/>
+        <w:t>Convingerea prosperă nr. 64:</w:t>
+      </w:r>
+      <w:r>
+        <w:t xml:space="preserve"> </w:t>
+      </w:r>
+      <w:r>
+        <w:t>„Banii trebuie să-mi servească scopurilor mele, banii trebuie să fie un bun slujitor!"</w:t>
+      </w:r>
+    </w:p>
+    <w:p>
+      <w:pPr>
+        <w:spacing w:after="0" w:line="240" w:lineRule="auto"/>
+      </w:pPr>
+      <w:r>
+        <w:t>Convingerea prosperă nr. 65:</w:t>
+      </w:r>
+      <w:r>
+        <w:t xml:space="preserve"> </w:t>
+      </w:r>
+      <w:r>
+        <w:t>Sărăcia sau bogăția din buzunar se vede, în primul rând, în sărăcia sau bogăția din minte!</w:t>
+      </w:r>
+    </w:p>
+    <w:p>
+      <w:pPr>
+        <w:spacing w:after="0" w:line="240" w:lineRule="auto"/>
+      </w:pPr>
+      <w:r>
+        <w:t>Convingerea prosperă nr. 66:</w:t>
+      </w:r>
+      <w:r>
+        <w:t xml:space="preserve"> </w:t>
+      </w:r>
+      <w:r>
+        <w:t>Să câștig 10.000$ este mult mai ușor decât să economisesc 10.000$. Cu cât înțeleg asta mai repede, cu atât viața mea se va îmbunătăți mai repede!</w:t>
+      </w:r>
+    </w:p>
+    <w:p>
+      <w:pPr>
+        <w:spacing w:after="0" w:line="240" w:lineRule="auto"/>
+      </w:pPr>
+      <w:r>
+        <w:t>Convingerea prosperă nr. 67:</w:t>
+      </w:r>
+      <w:r>
+        <w:t xml:space="preserve"> </w:t>
+      </w:r>
+      <w:r>
+        <w:t>„Prețul este ceea ce plătesc. Valoarea este ceea ce primesc!"</w:t>
+      </w:r>
+    </w:p>
+    <w:p>
+      <w:pPr>
+        <w:spacing w:after="0" w:line="240" w:lineRule="auto"/>
+      </w:pPr>
+      <w:r>
+        <w:t>Convingerea prosperă nr. 68:</w:t>
+      </w:r>
+      <w:r>
+        <w:t xml:space="preserve"> </w:t>
+      </w:r>
+      <w:r>
+        <w:t>„Sunt recunoscător pentru viața pe care o am!"</w:t>
+      </w:r>
+    </w:p>
+    <w:p>
+      <w:pPr>
+        <w:spacing w:after="0" w:line="240" w:lineRule="auto"/>
+      </w:pPr>
+      <w:r>
+        <w:t>Convingerea prosperă nr. 69:</w:t>
+      </w:r>
+      <w:r>
+        <w:t xml:space="preserve"> </w:t>
+      </w:r>
+      <w:r>
+        <w:t>„Lucrurile bune se întâmplă atunci când sunt dispus să ies din zona de confort!"</w:t>
+      </w:r>
+    </w:p>
+    <w:p>
+      <w:pPr>
+        <w:spacing w:after="0" w:line="240" w:lineRule="auto"/>
+      </w:pPr>
+      <w:r>
+        <w:t>Convingerea prosperă nr. 70:</w:t>
+      </w:r>
+      <w:r>
+        <w:t xml:space="preserve"> </w:t>
+      </w:r>
+      <w:r>
+        <w:t>„NU pot alege cărțile pe care mi le dă viața. Dar POT alege 100% modul în care le joc!"</w:t>
+      </w:r>
+    </w:p>
+    <w:p>
+      <w:pPr>
+        <w:spacing w:after="0" w:line="240" w:lineRule="auto"/>
+      </w:pPr>
+      <w:r>
+        <w:t>Convingerea prosperă nr. 71:</w:t>
+      </w:r>
+      <w:r>
+        <w:t xml:space="preserve"> </w:t>
+      </w:r>
+      <w:r>
+        <w:t>„Obstacolele nu îmi blochează calea. Ele sunt chiar calea însăși!"</w:t>
+      </w:r>
+    </w:p>
+    <w:p>
+      <w:pPr>
+        <w:spacing w:after="0" w:line="240" w:lineRule="auto"/>
+      </w:pPr>
+      <w:r>
+        <w:t>Convingerea prosperă nr. 72:</w:t>
+      </w:r>
+      <w:r>
+        <w:t xml:space="preserve"> </w:t>
+      </w:r>
+      <w:r>
+        <w:t>„Banii îmi permit să am grijă de cei dragi!"</w:t>
+      </w:r>
+    </w:p>
+    <w:p>
+      <w:pPr>
+        <w:spacing w:after="0" w:line="240" w:lineRule="auto"/>
+      </w:pPr>
+      <w:r>
+        <w:t>Convingerea prosperă nr. 73</w:t>
+      </w:r>
+      <w:r>
+        <w:t xml:space="preserve">: </w:t>
+      </w:r>
+      <w:r>
+        <w:t>Banii nu au ochi să vadă pe ce-i cheltui. Doar eu sunt responsabil de cum o fac!</w:t>
+      </w:r>
+    </w:p>
+    <w:p>
+      <w:pPr>
+        <w:spacing w:after="0" w:line="240" w:lineRule="auto"/>
+      </w:pPr>
+      <w:r>
+        <w:t>Convingerea prosperă nr. 74:</w:t>
+      </w:r>
+      <w:r>
+        <w:t xml:space="preserve"> </w:t>
+      </w:r>
+      <w:r>
+        <w:t>„Calitatea vieții mele se vede în alegerile pe care le fac zi de zi!"</w:t>
       </w:r>
     </w:p>
     <w:p>
@@ -541,7 +800,15 @@
     <w:p/>
     <w:p>
       <w:r>
-        <w:t>Case number: 08837732</w:t>
+        <w:t xml:space="preserve">Case </w:t>
+      </w:r>
+      <w:proofErr w:type="spellStart"/>
+      <w:r>
+        <w:t>number</w:t>
+      </w:r>
+      <w:proofErr w:type="spellEnd"/>
+      <w:r>
+        <w:t>: 08837732</w:t>
       </w:r>
     </w:p>
     <w:p>

</xml_diff>

<commit_message>
updates mid june 2026
</commit_message>
<xml_diff>
--- a/TRADING/Manuale_influenceri/Gabi_Balu/Convingeri_prospere.docx
+++ b/TRADING/Manuale_influenceri/Gabi_Balu/Convingeri_prospere.docx
@@ -102,6 +102,61 @@
       </w:pPr>
       <w:r>
         <w:rPr/>
+        <w:t>Convingerea prosperă nr. 1: „Sunt un manager de bani extraordinar”</w:t>
+      </w:r>
+    </w:p>
+    <w:p>
+      <w:pPr>
+        <w:pStyle w:val="Normal"/>
+        <w:spacing w:lineRule="auto" w:line="240" w:before="0" w:after="0"/>
+        <w:rPr/>
+      </w:pPr>
+      <w:r>
+        <w:rPr/>
+        <w:t>Convingerea prosperă nr. 2: „Mă plătesc pe mine primul întotdeauna”</w:t>
+      </w:r>
+    </w:p>
+    <w:p>
+      <w:pPr>
+        <w:pStyle w:val="Normal"/>
+        <w:spacing w:lineRule="auto" w:line="240" w:before="0" w:after="0"/>
+        <w:rPr/>
+      </w:pPr>
+      <w:r>
+        <w:rPr/>
+        <w:t>Convingerea prosperă nr. 3: "Banii mei lucrează din greu pentru mine și îmi fac din ce în ce mai mulți bani"</w:t>
+      </w:r>
+    </w:p>
+    <w:p>
+      <w:pPr>
+        <w:pStyle w:val="Normal"/>
+        <w:spacing w:lineRule="auto" w:line="240" w:before="0" w:after="0"/>
+        <w:rPr/>
+      </w:pPr>
+      <w:r>
+        <w:rPr/>
+        <w:t>Convingerea prosperă nr. 4: "Adaug bani în fondul meu de libertate financiară în fiecare lună"</w:t>
+      </w:r>
+    </w:p>
+    <w:p>
+      <w:pPr>
+        <w:pStyle w:val="Normal"/>
+        <w:spacing w:lineRule="auto" w:line="240" w:before="0" w:after="0"/>
+        <w:rPr/>
+      </w:pPr>
+      <w:r>
+        <w:rPr/>
+        <w:t>Convingerea prosperă nr. 5: "Câștig suficient venit pasiv pentru a-mi satisface stilul de viață pe care mi-l doresc!"</w:t>
+      </w:r>
+    </w:p>
+    <w:p>
+      <w:pPr>
+        <w:pStyle w:val="Normal"/>
+        <w:spacing w:lineRule="auto" w:line="240" w:before="0" w:after="0"/>
+        <w:rPr/>
+      </w:pPr>
+      <w:r>
+        <w:rPr/>
         <w:t>Convingerea prosperă nr. 6: "EU îmi creez viața! EU îmi creez propriul nivel de succes financiar! Nimeni altcineva!"</w:t>
       </w:r>
     </w:p>
@@ -278,7 +333,7 @@
       </w:pPr>
       <w:r>
         <w:rPr/>
-        <w:t>Convingerea pozitivă nr. 22: "Banii îmi permit să impactez în bine viețile oamenilor!"</w:t>
+        <w:t>Convingerea prosperă nr. 22: "Banii îmi permit să impactez în bine viețile oamenilor!"</w:t>
       </w:r>
     </w:p>
     <w:p>
@@ -817,7 +872,7 @@
       </w:pPr>
       <w:r>
         <w:rPr/>
-        <w:t>Convingerea prosperă nr. 73: Banii nu au ochi să vadă pe ce-i cheltui. Doar eu sunt responsabil de cum o fac!</w:t>
+        <w:t>Convingerea prosperă nr. 73: „Banii nu au ochi să vadă pe ce-i cheltui. Doar eu sunt responsabil de cum o fac!”</w:t>
       </w:r>
     </w:p>
     <w:p>
@@ -872,56 +927,312 @@
       </w:pPr>
       <w:r>
         <w:rPr/>
-      </w:r>
-    </w:p>
-    <w:p>
-      <w:pPr>
-        <w:pStyle w:val="Normal"/>
-        <w:spacing w:lineRule="auto" w:line="240" w:before="0" w:after="0"/>
-        <w:rPr/>
-      </w:pPr>
-      <w:r>
-        <w:rPr/>
-      </w:r>
-    </w:p>
-    <w:p>
-      <w:pPr>
-        <w:pStyle w:val="Normal"/>
-        <w:spacing w:lineRule="auto" w:line="240" w:before="0" w:after="0"/>
-        <w:rPr/>
-      </w:pPr>
-      <w:r>
-        <w:rPr/>
-      </w:r>
-    </w:p>
-    <w:p>
-      <w:pPr>
-        <w:pStyle w:val="Normal"/>
-        <w:spacing w:lineRule="auto" w:line="240" w:before="0" w:after="0"/>
-        <w:rPr/>
-      </w:pPr>
-      <w:r>
-        <w:rPr/>
-      </w:r>
-    </w:p>
-    <w:p>
-      <w:pPr>
-        <w:pStyle w:val="Normal"/>
-        <w:spacing w:lineRule="auto" w:line="240" w:before="0" w:after="0"/>
-        <w:rPr/>
-      </w:pPr>
-      <w:r>
-        <w:rPr/>
-      </w:r>
-    </w:p>
-    <w:p>
-      <w:pPr>
-        <w:pStyle w:val="Normal"/>
-        <w:spacing w:lineRule="auto" w:line="240" w:before="0" w:after="0"/>
-        <w:rPr/>
-      </w:pPr>
-      <w:r>
-        <w:rPr/>
+        <w:t>Convingerea prosperă nr. 78: „Rezultatele mărețe nu au venit niciodată din zona de confort!”</w:t>
+      </w:r>
+    </w:p>
+    <w:p>
+      <w:pPr>
+        <w:pStyle w:val="Normal"/>
+        <w:spacing w:lineRule="auto" w:line="240" w:before="0" w:after="0"/>
+        <w:rPr/>
+      </w:pPr>
+      <w:r>
+        <w:rPr/>
+        <w:t>Convingerea prosperă nr. 79: „Unii oameni sunt facturi, în timp ce alți oameni sunt investitii. Alege-ti anturajul cu grija!”</w:t>
+      </w:r>
+    </w:p>
+    <w:p>
+      <w:pPr>
+        <w:pStyle w:val="Normal"/>
+        <w:spacing w:lineRule="auto" w:line="240" w:before="0" w:after="0"/>
+        <w:rPr/>
+      </w:pPr>
+      <w:r>
+        <w:rPr/>
+        <w:t>Convingerea prosperă nr. 80: „A avea acces la oameni mai deștepți decât mine este o binecuvântare, nu o amenințare!"</w:t>
+      </w:r>
+    </w:p>
+    <w:p>
+      <w:pPr>
+        <w:pStyle w:val="Normal"/>
+        <w:spacing w:lineRule="auto" w:line="240" w:before="0" w:after="0"/>
+        <w:rPr/>
+      </w:pPr>
+      <w:r>
+        <w:rPr/>
+        <w:t>Convingerea prosperă nr. 81: „Practica imperfectă bate teoria perfectă!"</w:t>
+      </w:r>
+    </w:p>
+    <w:p>
+      <w:pPr>
+        <w:pStyle w:val="Normal"/>
+        <w:spacing w:lineRule="auto" w:line="240" w:before="0" w:after="0"/>
+        <w:rPr/>
+      </w:pPr>
+      <w:r>
+        <w:rPr/>
+        <w:t>Convingerea prosperă nr. 82: „În orice moment avem 2 alegeri: a merge înainte către prosperitate, sau a da înapoi către siguranță!"</w:t>
+      </w:r>
+    </w:p>
+    <w:p>
+      <w:pPr>
+        <w:pStyle w:val="Normal"/>
+        <w:spacing w:lineRule="auto" w:line="240" w:before="0" w:after="0"/>
+        <w:rPr/>
+      </w:pPr>
+      <w:r>
+        <w:rPr/>
+        <w:t>Convingerea prosperă nr. 83: „Viața devine mai ușoară atunci când elimini oamenii negativi de lângă tine!"</w:t>
+      </w:r>
+    </w:p>
+    <w:p>
+      <w:pPr>
+        <w:pStyle w:val="Normal"/>
+        <w:spacing w:lineRule="auto" w:line="240" w:before="0" w:after="0"/>
+        <w:rPr/>
+      </w:pPr>
+      <w:r>
+        <w:rPr/>
+        <w:t>Convingerea prosperă nr. 84:</w:t>
+      </w:r>
+    </w:p>
+    <w:p>
+      <w:pPr>
+        <w:pStyle w:val="Normal"/>
+        <w:spacing w:lineRule="auto" w:line="240" w:before="0" w:after="0"/>
+        <w:rPr/>
+      </w:pPr>
+      <w:r>
+        <w:rPr/>
+        <w:t>Dacă nu pot schimba circumstanțele exterioare, îmi voi schimba atitudinea!</w:t>
+      </w:r>
+    </w:p>
+    <w:p>
+      <w:pPr>
+        <w:pStyle w:val="Normal"/>
+        <w:spacing w:lineRule="auto" w:line="240" w:before="0" w:after="0"/>
+        <w:rPr/>
+      </w:pPr>
+      <w:r>
+        <w:rPr/>
+        <w:t>Partea faină e că atunci când îți schimbi atitudinea, se schimbă și circumstanțele!</w:t>
+      </w:r>
+    </w:p>
+    <w:p>
+      <w:pPr>
+        <w:pStyle w:val="Normal"/>
+        <w:spacing w:lineRule="auto" w:line="240" w:before="0" w:after="0"/>
+        <w:rPr/>
+      </w:pPr>
+      <w:r>
+        <w:rPr/>
+        <w:t>Convingerea prosperă nr. 85: Una din cele mai importante abilități ale unui investitor este să știi ce nu știi!</w:t>
+      </w:r>
+    </w:p>
+    <w:p>
+      <w:pPr>
+        <w:pStyle w:val="Normal"/>
+        <w:spacing w:lineRule="auto" w:line="240" w:before="0" w:after="0"/>
+        <w:rPr/>
+      </w:pPr>
+      <w:r>
+        <w:rPr/>
+        <w:t>Convingerea prosperă nr. 86: Când îți vine să renunți, amintește-ți DE CE ai început!</w:t>
+      </w:r>
+    </w:p>
+    <w:p>
+      <w:pPr>
+        <w:pStyle w:val="Normal"/>
+        <w:spacing w:lineRule="auto" w:line="240" w:before="0" w:after="0"/>
+        <w:rPr/>
+      </w:pPr>
+      <w:r>
+        <w:rPr/>
+        <w:t>Convingerea prosperă nr. 87: Poți avea mai mult decât ai pentru că poți deveni mai mult decât ești!</w:t>
+      </w:r>
+    </w:p>
+    <w:p>
+      <w:pPr>
+        <w:pStyle w:val="Normal"/>
+        <w:spacing w:lineRule="auto" w:line="240" w:before="0" w:after="0"/>
+        <w:rPr/>
+      </w:pPr>
+      <w:r>
+        <w:rPr/>
+        <w:t>Convingerea prosperă nr. 88: „Obstacolele în calea celui slab devin trepte în calea celui puternic!"</w:t>
+      </w:r>
+    </w:p>
+    <w:p>
+      <w:pPr>
+        <w:pStyle w:val="Normal"/>
+        <w:spacing w:lineRule="auto" w:line="240" w:before="0" w:after="0"/>
+        <w:rPr/>
+      </w:pPr>
+      <w:r>
+        <w:rPr/>
+        <w:t>Convingerea prosperă nr. 89: „Dacă vrei să reușești,  alege un țel care este important pentru tine, nu pentru alții!"</w:t>
+      </w:r>
+    </w:p>
+    <w:p>
+      <w:pPr>
+        <w:pStyle w:val="Normal"/>
+        <w:spacing w:lineRule="auto" w:line="240" w:before="0" w:after="0"/>
+        <w:rPr/>
+      </w:pPr>
+      <w:r>
+        <w:rPr/>
+        <w:t>Convingerea prosperă nr. 90: „Acolo unde este frica ta, tot acolo este și oportunitatea de a crește!"</w:t>
+      </w:r>
+    </w:p>
+    <w:p>
+      <w:pPr>
+        <w:pStyle w:val="Normal"/>
+        <w:spacing w:lineRule="auto" w:line="240" w:before="0" w:after="0"/>
+        <w:rPr/>
+      </w:pPr>
+      <w:r>
+        <w:rPr/>
+        <w:t>Convingerea prosperă nr. 91: Există 2 opțiuni: fie progres, fie scuze!</w:t>
+      </w:r>
+    </w:p>
+    <w:p>
+      <w:pPr>
+        <w:pStyle w:val="Normal"/>
+        <w:spacing w:lineRule="auto" w:line="240" w:before="0" w:after="0"/>
+        <w:rPr/>
+      </w:pPr>
+      <w:r>
+        <w:rPr/>
+        <w:t>Convingerea prosperă nr. 92: Nu subestima niciodată importanța pașilor mici!</w:t>
+      </w:r>
+    </w:p>
+    <w:p>
+      <w:pPr>
+        <w:pStyle w:val="Normal"/>
+        <w:spacing w:lineRule="auto" w:line="240" w:before="0" w:after="0"/>
+        <w:rPr/>
+      </w:pPr>
+      <w:r>
+        <w:rPr/>
+        <w:t>Convingerea prosperă nr. 93: NU ceea ce facem din când în când ne modelează viața. Ci ceea ce facem în mod constant!</w:t>
+      </w:r>
+    </w:p>
+    <w:p>
+      <w:pPr>
+        <w:pStyle w:val="Normal"/>
+        <w:spacing w:lineRule="auto" w:line="240" w:before="0" w:after="0"/>
+        <w:rPr/>
+      </w:pPr>
+      <w:r>
+        <w:rPr/>
+        <w:t>Convingerea prosperă nr. 94: „ Cel mai înspăimântător loc în care te poți afla este același loc ca și anul trecut! CREȘTI!"</w:t>
+      </w:r>
+    </w:p>
+    <w:p>
+      <w:pPr>
+        <w:pStyle w:val="Normal"/>
+        <w:spacing w:lineRule="auto" w:line="240" w:before="0" w:after="0"/>
+        <w:rPr/>
+      </w:pPr>
+      <w:r>
+        <w:rPr/>
+        <w:t>Convingerea prosperă nr. 95: „Dacă mă concentrez pe oportunități, oportunitățile cresc"</w:t>
+      </w:r>
+    </w:p>
+    <w:p>
+      <w:pPr>
+        <w:pStyle w:val="Normal"/>
+        <w:spacing w:lineRule="auto" w:line="240" w:before="0" w:after="0"/>
+        <w:rPr/>
+      </w:pPr>
+      <w:r>
+        <w:rPr/>
+        <w:t>Convingerea prosperă nr. 96: Nu ne putem rezolva problemele cu aceeași mentalitate cu care le-am creat!</w:t>
+      </w:r>
+    </w:p>
+    <w:p>
+      <w:pPr>
+        <w:pStyle w:val="Normal"/>
+        <w:spacing w:lineRule="auto" w:line="240" w:before="0" w:after="0"/>
+        <w:rPr/>
+      </w:pPr>
+      <w:r>
+        <w:rPr/>
+        <w:t>Convingerea prosperă nr. 97: „Adevărata valoare în viață nu este ceea ce obții. Adevărata valoare în viață este ceea ce devii!”</w:t>
+      </w:r>
+    </w:p>
+    <w:p>
+      <w:pPr>
+        <w:pStyle w:val="Normal"/>
+        <w:spacing w:lineRule="auto" w:line="240" w:before="0" w:after="0"/>
+        <w:rPr/>
+      </w:pPr>
+      <w:r>
+        <w:rPr/>
+        <w:t>Convingerea prosperă nr. 98: "Dacă nu ești dispus să riști în a face lucruri neobișnuite, va trebui să te mulțumești cu normalul!"</w:t>
+      </w:r>
+    </w:p>
+    <w:p>
+      <w:pPr>
+        <w:pStyle w:val="Normal"/>
+        <w:spacing w:lineRule="auto" w:line="240" w:before="0" w:after="0"/>
+        <w:rPr/>
+      </w:pPr>
+      <w:r>
+        <w:rPr/>
+        <w:t>Convingerea prosperă nr. 99: "Oportunitatea vine adesea deghizată sub forma unei probleme sau unui eșec temporar."</w:t>
+      </w:r>
+    </w:p>
+    <w:p>
+      <w:pPr>
+        <w:pStyle w:val="Normal"/>
+        <w:spacing w:lineRule="auto" w:line="240" w:before="0" w:after="0"/>
+        <w:rPr/>
+      </w:pPr>
+      <w:r>
+        <w:rPr/>
+        <w:t>Convingerea prosperă nr. 100: Dacă îți dorești să realizezi ceva cu adevărat, vei găsi o cale. Dacă nu, vei găsi scuze!</w:t>
+      </w:r>
+    </w:p>
+    <w:p>
+      <w:pPr>
+        <w:pStyle w:val="Normal"/>
+        <w:spacing w:lineRule="auto" w:line="240" w:before="0" w:after="0"/>
+        <w:rPr/>
+      </w:pPr>
+      <w:r>
+        <w:rPr/>
+      </w:r>
+    </w:p>
+    <w:p>
+      <w:pPr>
+        <w:pStyle w:val="Normal"/>
+        <w:spacing w:lineRule="auto" w:line="240" w:before="0" w:after="0"/>
+        <w:rPr/>
+      </w:pPr>
+      <w:r>
+        <w:rPr/>
+      </w:r>
+    </w:p>
+    <w:p>
+      <w:pPr>
+        <w:pStyle w:val="Normal"/>
+        <w:spacing w:lineRule="auto" w:line="240" w:before="0" w:after="0"/>
+        <w:rPr/>
+      </w:pPr>
+      <w:r>
+        <w:rPr/>
+      </w:r>
+    </w:p>
+    <w:p>
+      <w:pPr>
+        <w:pStyle w:val="Normal"/>
+        <w:spacing w:lineRule="auto" w:line="240" w:before="0" w:after="0"/>
+        <w:rPr/>
+      </w:pPr>
+      <w:r>
+        <w:rPr/>
+        <w:t>Bonus:</w:t>
       </w:r>
     </w:p>
     <w:p>
@@ -950,43 +1261,16 @@
       <w:pPr>
         <w:pStyle w:val="Normal"/>
         <w:spacing w:lineRule="auto" w:line="240" w:before="0" w:after="0"/>
-        <w:rPr/>
-      </w:pPr>
-      <w:r>
-        <w:rPr/>
-        <w:t>Dacă ești o floare între flori într-un sol fertil și ai parte de îngrijire constantă, vei crește frumos.</w:t>
-      </w:r>
-    </w:p>
-    <w:p>
-      <w:pPr>
-        <w:pStyle w:val="Normal"/>
-        <w:rPr/>
-      </w:pPr>
-      <w:r>
-        <w:rPr/>
-      </w:r>
-    </w:p>
-    <w:p>
-      <w:pPr>
-        <w:pStyle w:val="Normal"/>
-        <w:rPr/>
-      </w:pPr>
-      <w:r>
-        <w:rPr/>
-        <w:t>Case number: 08837732</w:t>
-      </w:r>
-    </w:p>
-    <w:p>
-      <w:pPr>
-        <w:pStyle w:val="Normal"/>
-        <w:rPr/>
+        <w:rPr>
+          <w:rStyle w:val="Hyperlink"/>
+        </w:rPr>
       </w:pPr>
       <w:hyperlink r:id="rId2">
         <w:r>
           <w:rPr>
-            <w:rStyle w:val="Hyperlink"/>
+            <w:rStyle w:val="Style"/>
           </w:rPr>
-          <w:t>https://www.etoro.com/customer-service/</w:t>
+          <w:t>Dacă ești o floare între flori într-un sol fertil și ai parte de îngrijire constantă, vei crește frumos.</w:t>
         </w:r>
       </w:hyperlink>
     </w:p>
@@ -1418,6 +1702,7 @@
     <w:qFormat/>
     <w:pPr>
       <w:widowControl/>
+      <w:suppressAutoHyphens w:val="true"/>
       <w:bidi w:val="0"/>
       <w:spacing w:lineRule="auto" w:line="278" w:before="0" w:after="160"/>
       <w:jc w:val="start"/>

</xml_diff>